<commit_message>
Deploy simternship build 2026-09-09
</commit_message>
<xml_diff>
--- a/hub/files/Case1.docx
+++ b/hub/files/Case1.docx
@@ -71,7 +71,7 @@
                 <w:b/>
                 <w:sz w:val="19"/>
               </w:rPr>
-              <w:t xml:space="preserve"> (every team; I present this case as the format demonstration)</w:t>
+              <w:t xml:space="preserve"> (every student, individual; I present this case as the format demonstration)</w:t>
             </w:r>
           </w:p>
         </w:tc>
@@ -109,7 +109,7 @@
               <w:rPr>
                 <w:sz w:val="19"/>
               </w:rPr>
-              <w:t>Mon Sep 14, start of class (worksheet, all teams); I present the case in person that day as the demo for Cases 2–6</w:t>
+              <w:t>Mon Sep 14, start of class (write-up, every student); I present the case in person that day as the demo for Cases 2–6</w:t>
             </w:r>
           </w:p>
         </w:tc>
@@ -147,7 +147,7 @@
               <w:rPr>
                 <w:sz w:val="19"/>
               </w:rPr>
-              <w:t>Team</w:t>
+              <w:t>Individual write-up</w:t>
             </w:r>
           </w:p>
         </w:tc>
@@ -185,7 +185,20 @@
               <w:rPr>
                 <w:sz w:val="19"/>
               </w:rPr>
-              <w:t>Canvas — this doc's worksheet filled (one PDF per team)</w:t>
+              <w:t xml:space="preserve">Canvas — this doc filled (Box A, Box B, Box C), </w:t>
+            </w:r>
+            <w:r>
+              <w:rPr>
+                <w:b/>
+                <w:sz w:val="19"/>
+              </w:rPr>
+              <w:t>.docx</w:t>
+            </w:r>
+            <w:r>
+              <w:rPr>
+                <w:sz w:val="19"/>
+              </w:rPr>
+              <w:t>, one per student</w:t>
             </w:r>
           </w:p>
         </w:tc>
@@ -253,7 +266,16 @@
     </w:p>
     <w:p>
       <w:r>
-        <w:t xml:space="preserve">*Voice-first prep: after reading the case yourself, talk it through with the </w:t>
+        <w:t xml:space="preserve">*Three boxes, in order: </w:t>
+      </w:r>
+      <w:r>
+        <w:rPr>
+          <w:b/>
+        </w:rPr>
+        <w:t>Box A</w:t>
+      </w:r>
+      <w:r>
+        <w:t xml:space="preserve"> (your first take, before the tutor) → the </w:t>
       </w:r>
       <w:r>
         <w:rPr>
@@ -262,7 +284,7 @@
         <w:t>AI voice tutor</w:t>
       </w:r>
       <w:r>
-        <w:t xml:space="preserve"> (ChatGPT voice mode; starter prompt below) with the assigned textbook chapter — </w:t>
+        <w:t xml:space="preserve"> session (ChatGPT voice mode; starter prompt below; the assigned chapter — </w:t>
       </w:r>
       <w:r>
         <w:rPr>
@@ -271,7 +293,25 @@
         <w:t>Ch. 2, The Marketing Research Process</w:t>
       </w:r>
       <w:r>
-        <w:t xml:space="preserve"> — in hand as context. The tutor quizzes and challenges rather than answering. Disclose the session in the AI reflection.*</w:t>
+        <w:t xml:space="preserve"> — in hand) → </w:t>
+      </w:r>
+      <w:r>
+        <w:rPr>
+          <w:b/>
+        </w:rPr>
+        <w:t>Box B</w:t>
+      </w:r>
+      <w:r>
+        <w:t xml:space="preserve"> (your answer after the tutor) → </w:t>
+      </w:r>
+      <w:r>
+        <w:rPr>
+          <w:b/>
+        </w:rPr>
+        <w:t>Box C</w:t>
+      </w:r>
+      <w:r>
+        <w:t xml:space="preserve"> (what changed, plus the transcript link). Individual work. The tutor quizzes and challenges rather than answering.*</w:t>
       </w:r>
     </w:p>
     <w:p>
@@ -279,7 +319,16 @@
         <w:pStyle w:val="ListNumber"/>
       </w:pPr>
       <w:r>
-        <w:t>Read the case (Appendix A) individually, then discuss as a team before consulting AI.</w:t>
+        <w:t xml:space="preserve">Read the case (Appendix A) individually, then fill </w:t>
+      </w:r>
+      <w:r>
+        <w:rPr>
+          <w:b/>
+        </w:rPr>
+        <w:t>Box A</w:t>
+      </w:r>
+      <w:r>
+        <w:t xml:space="preserve"> — your first take, before the tutor (10–15 min; rough is fine).</w:t>
       </w:r>
     </w:p>
     <w:p>
@@ -355,7 +404,25 @@
         <w:pStyle w:val="ListNumber"/>
       </w:pPr>
       <w:r>
-        <w:t>Fill the worksheet (Appendix B). Then watch my demo closely — it models exactly what your team's own case presentation (Cases 2–6) must do: teach the case's key idea clearly, and add at least one thing the Monday lecture and the textbook chapter don't cover.</w:t>
+        <w:t xml:space="preserve">Run the voice session (one push minimum), then fill </w:t>
+      </w:r>
+      <w:r>
+        <w:rPr>
+          <w:b/>
+        </w:rPr>
+        <w:t>Box B</w:t>
+      </w:r>
+      <w:r>
+        <w:t xml:space="preserve"> and the </w:t>
+      </w:r>
+      <w:r>
+        <w:rPr>
+          <w:b/>
+        </w:rPr>
+        <w:t>Box C</w:t>
+      </w:r>
+      <w:r>
+        <w:t xml:space="preserve"> delta log (Appendix B). Then watch my demo closely — it models exactly what your team's case presentation (Cases 2–6) must do: teach the case's key idea clearly, and add at least one thing the Monday lecture and the textbook chapter don't cover.</w:t>
       </w:r>
     </w:p>
     <w:p>
@@ -377,7 +444,7 @@
         <w:t>Burns &amp; Veeck, *Marketing Research* (10th ed.), Ch. 2 — The Marketing Research Process</w:t>
       </w:r>
       <w:r>
-        <w:t xml:space="preserve"> open (eText or printout) during the session. Copy the prompt below into ChatGPT, switch to voice mode, and work the case out loud:</w:t>
+        <w:t xml:space="preserve"> open (eText or printout); if you have the chapter as a Word text file, attach it with the case. Fill Box A first, then paste the prompt below into ChatGPT, switch to voice mode, and work the case out loud:</w:t>
       </w:r>
     </w:p>
     <w:p>
@@ -389,7 +456,7 @@
           <w:i/>
           <w:sz w:val="19"/>
         </w:rPr>
-        <w:t>You are my marketing-research case tutor. I am preparing the attached mini-case for IBM 3302. I also have the assigned textbook chapter in front of me — when I cite it, push me to connect the concept to the case. Your rules: quiz me and challenge my positions with follow-up questions; never give me the answer outright; when I'm vague, demand the specific concept, variable, or decision rule; end by making me state my team's final answers out loud so I can write them down. Start by asking me what the case's core decision is.</w:t>
+        <w:t>You are my marketing-research case tutor for IBM 3302. The mini-case is attached and I have the assigned textbook chapter in front of me. I have written my first-take answers and will read them to you row by row. Rules: never give me the answer. Start by asking me the case's core decision, then quiz me on two case facts. For each row, ask one follow-up that tests whether I am using the chapter's concept correctly; push back hard on my weakest row at least once. Cite the chapter by section heading ("section Y"). After I defend a row through one or two rounds, say it is defensible enough and move on — good enough is my call. End by having me state my final answers out loud.</w:t>
       </w:r>
     </w:p>
     <w:p>
@@ -411,7 +478,16 @@
         <w:t xml:space="preserve">☐  </w:t>
       </w:r>
       <w:r>
-        <w:t>Filled worksheet (Appendix B) as one PDF — every team</w:t>
+        <w:t xml:space="preserve">This doc with Box A, Box B, and Box C filled — </w:t>
+      </w:r>
+      <w:r>
+        <w:rPr>
+          <w:b/>
+        </w:rPr>
+        <w:t>.docx</w:t>
+      </w:r>
+      <w:r>
+        <w:t>, one per student</w:t>
       </w:r>
     </w:p>
     <w:p>
@@ -425,7 +501,7 @@
         <w:t xml:space="preserve">☐  </w:t>
       </w:r>
       <w:r>
-        <w:t>AI reflection (below) answered at the end of the worksheet</w:t>
+        <w:t>Transcript link in Box C (Google Doc or Drive PDF, Anyone with the link — test it in a private window)</w:t>
       </w:r>
     </w:p>
     <w:p>
@@ -444,10 +520,10 @@
         <w:rPr>
           <w:b/>
         </w:rPr>
-        <w:t>Write-up (5 pts, every team including the presenters):</w:t>
+        <w:t>Write-up (5 pts, every student, individual):</w:t>
       </w:r>
       <w:r>
-        <w:t xml:space="preserve"> graded on the same instrument for all teams — 5 = complete and substantially correct, with a specific AI reflection · 3 = complete but generic or with major errors · 0–1 = missing or perfunctory. The rubric below is the one your team's Cases 2–6 presentation (20 pts) will be scored on; my demo models it.</w:t>
+        <w:t xml:space="preserve"> 5 = Box B complete and substantially correct against the key, Box A visibly earlier and rougher than B, Box C shows one real push with a tagged change or a reasoned "kept it", link opens · 3 = complete, but Box A mirrors B, Box C generic, or a major content error · 1 = a box or the link missing · 0 = not submitted. The rubric below is the one your team's Cases 2–6 presentation (20 pts) will be scored on; my demo models it.</w:t>
       </w:r>
     </w:p>
     <w:tbl>
@@ -798,7 +874,7 @@
               <w:rPr>
                 <w:sz w:val="19"/>
               </w:rPr>
-              <w:t>Human-first draft documented; the four reflection prompts answered specifically, not generically</w:t>
+              <w:t>Box A honestly earlier than Box B; Box C shows one real push with a tagged change or a reasoned rejection; transcript link opens</w:t>
             </w:r>
           </w:p>
         </w:tc>
@@ -810,7 +886,7 @@
         <w:pStyle w:val="Heading2"/>
       </w:pPr>
       <w:r>
-        <w:t>AI reflection (required)</w:t>
+        <w:t>Delta log (required)</w:t>
       </w:r>
     </w:p>
     <w:p>
@@ -818,35 +894,55 @@
         <w:rPr>
           <w:b/>
         </w:rPr>
-        <w:t>Human first.</w:t>
+        <w:t>Human first, then one push.</w:t>
       </w:r>
       <w:r>
-        <w:t xml:space="preserve"> Draft or plan this assignment yourselves before any AI touches it. That order is the point: it is the only way to see what AI actually adds — or quietly subtracts. Then use AI to improve your draft, and answer the four prompts below (2–4 sentences each, specific to THIS assignment):</w:t>
+        <w:t xml:space="preserve"> Write Box A before the tutor hears anything. In the session the tutor pushes back on at least one row; Box C records that push and what you did with it. Tag each change carried into Box B — </w:t>
       </w:r>
-    </w:p>
-    <w:p>
       <w:r>
-        <w:t>(a) The most important change we made after using AI was…</w:t>
+        <w:rPr>
+          <w:b/>
+        </w:rPr>
+        <w:t>[evidence]</w:t>
       </w:r>
-    </w:p>
-    <w:p>
       <w:r>
-        <w:t>(b) We accepted this change because…</w:t>
+        <w:t xml:space="preserve"> (missed case fact) · </w:t>
       </w:r>
-    </w:p>
-    <w:p>
       <w:r>
-        <w:t>(c) We rejected or substantially revised the AI suggestion that…</w:t>
+        <w:rPr>
+          <w:b/>
+        </w:rPr>
+        <w:t>[concept]</w:t>
       </w:r>
-    </w:p>
-    <w:p>
       <w:r>
-        <w:t>(d) One uncertainty or question that remains is…</w:t>
+        <w:t xml:space="preserve"> (term used loosely) · </w:t>
       </w:r>
-    </w:p>
-    <w:p>
       <w:r>
-        <w:t>List the tools you used and for what. Generic answers ("AI helped us improve clarity") score zero on this category; name the actual change.</w:t>
+        <w:rPr>
+          <w:b/>
+        </w:rPr>
+        <w:t>[structure]</w:t>
+      </w:r>
+      <w:r>
+        <w:t xml:space="preserve"> (row belongs elsewhere) · </w:t>
+      </w:r>
+      <w:r>
+        <w:rPr>
+          <w:b/>
+        </w:rPr>
+        <w:t>[wording]</w:t>
+      </w:r>
+      <w:r>
+        <w:t xml:space="preserve"> — and name one suggestion you rejected or pushed back on, with the reason. </w:t>
+      </w:r>
+      <w:r>
+        <w:rPr>
+          <w:b/>
+        </w:rPr>
+        <w:t>Stopping is your call:</w:t>
+      </w:r>
+      <w:r>
+        <w:t xml:space="preserve"> one or two defended rounds per row is the finish line, not the tutor's last objection. Paste a transcript link the grader can open. Generic entries ("AI improved my clarity") score zero here.</w:t>
       </w:r>
     </w:p>
     <w:p>
@@ -904,7 +1000,32 @@
         <w:pStyle w:val="Heading2"/>
       </w:pPr>
       <w:r>
-        <w:t>Appendix B — Worksheet (fill this out)</w:t>
+        <w:t>Appendix B — Worksheet: three boxes, in order</w:t>
+      </w:r>
+    </w:p>
+    <w:p>
+      <w:pPr>
+        <w:pStyle w:val="Heading3"/>
+      </w:pPr>
+      <w:r>
+        <w:t>Box A — My first take (before the tutor)</w:t>
+      </w:r>
+    </w:p>
+    <w:p>
+      <w:r>
+        <w:rPr>
+          <w:i/>
+        </w:rPr>
+        <w:t>Fill this from the case and the chapter only, before the voice session (10–15 min). Rough is fine: bullets, hedges, a guess you are unsure about. Do not edit it afterward — the grader compares it with Box B.</w:t>
+      </w:r>
+      <w:r>
+        <w:t xml:space="preserve"> </w:t>
+      </w:r>
+      <w:r>
+        <w:rPr>
+          <w:i/>
+        </w:rPr>
+        <w:t>If you did the Sep 9 workshop, Box A is what you had at the end of it.</w:t>
       </w:r>
     </w:p>
     <w:tbl>
@@ -954,7 +1075,7 @@
                 <w:b/>
                 <w:sz w:val="19"/>
               </w:rPr>
-              <w:t>Your team's answer</w:t>
+              <w:t>Your answer</w:t>
             </w:r>
           </w:p>
         </w:tc>
@@ -1340,11 +1461,19 @@
     </w:tbl>
     <w:p/>
     <w:p>
+      <w:pPr>
+        <w:pStyle w:val="Heading3"/>
+      </w:pPr>
+      <w:r>
+        <w:t>Box B — After the tutor</w:t>
+      </w:r>
+    </w:p>
+    <w:p>
       <w:r>
         <w:rPr>
-          <w:b/>
+          <w:i/>
         </w:rPr>
-        <w:t>AI reflection (a)–(d) + tools used:</w:t>
+        <w:t>Copy your Box A answers down and revise them after the session. This is the box graded against the answer key.</w:t>
       </w:r>
     </w:p>
     <w:tbl>
@@ -1394,7 +1523,7 @@
                 <w:b/>
                 <w:sz w:val="19"/>
               </w:rPr>
-              <w:t>Answer</w:t>
+              <w:t>Your answer</w:t>
             </w:r>
           </w:p>
         </w:tc>
@@ -1412,9 +1541,16 @@
             </w:r>
             <w:r>
               <w:rPr>
+                <w:b/>
                 <w:sz w:val="19"/>
               </w:rPr>
-              <w:t>(a) Most important change after AI</w:t>
+              <w:t>1. Management problem</w:t>
+            </w:r>
+            <w:r>
+              <w:rPr>
+                <w:sz w:val="19"/>
+              </w:rPr>
+              <w:t xml:space="preserve"> (1–2 sentences — the decision, not the symptom)</w:t>
             </w:r>
           </w:p>
         </w:tc>
@@ -1444,9 +1580,16 @@
             </w:r>
             <w:r>
               <w:rPr>
+                <w:b/>
                 <w:sz w:val="19"/>
               </w:rPr>
-              <w:t>(b) Why we accepted it</w:t>
+              <w:t>2. Major decisions</w:t>
+            </w:r>
+            <w:r>
+              <w:rPr>
+                <w:sz w:val="19"/>
+              </w:rPr>
+              <w:t xml:space="preserve"> (list each decision the expansion choice implies)</w:t>
             </w:r>
           </w:p>
         </w:tc>
@@ -1476,9 +1619,16 @@
             </w:r>
             <w:r>
               <w:rPr>
+                <w:b/>
                 <w:sz w:val="19"/>
               </w:rPr>
-              <w:t>(c) AI suggestion we rejected/revised</w:t>
+              <w:t>3. Information needed</w:t>
+            </w:r>
+            <w:r>
+              <w:rPr>
+                <w:sz w:val="19"/>
+              </w:rPr>
+              <w:t xml:space="preserve"> — Decision 1</w:t>
             </w:r>
           </w:p>
         </w:tc>
@@ -1508,9 +1658,16 @@
             </w:r>
             <w:r>
               <w:rPr>
+                <w:b/>
                 <w:sz w:val="19"/>
               </w:rPr>
-              <w:t>(d) Remaining uncertainty</w:t>
+              <w:t>3. Information needed</w:t>
+            </w:r>
+            <w:r>
+              <w:rPr>
+                <w:sz w:val="19"/>
+              </w:rPr>
+              <w:t xml:space="preserve"> — Decision 2</w:t>
             </w:r>
           </w:p>
         </w:tc>
@@ -1540,9 +1697,417 @@
             </w:r>
             <w:r>
               <w:rPr>
+                <w:b/>
                 <w:sz w:val="19"/>
               </w:rPr>
-              <w:t>Tools used, and for what</w:t>
+              <w:t>3. Information needed</w:t>
+            </w:r>
+            <w:r>
+              <w:rPr>
+                <w:sz w:val="19"/>
+              </w:rPr>
+              <w:t xml:space="preserve"> — Decision 3 (add rows as needed)</w:t>
+            </w:r>
+          </w:p>
+        </w:tc>
+        <w:tc>
+          <w:tcPr>
+            <w:tcW w:type="dxa" w:w="4968"/>
+          </w:tcPr>
+          <w:p>
+            <w:r>
+              <w:rPr>
+                <w:sz w:val="19"/>
+              </w:rPr>
+            </w:r>
+          </w:p>
+        </w:tc>
+      </w:tr>
+      <w:tr>
+        <w:tc>
+          <w:tcPr>
+            <w:tcW w:type="dxa" w:w="4968"/>
+          </w:tcPr>
+          <w:p>
+            <w:r>
+              <w:rPr>
+                <w:sz w:val="19"/>
+              </w:rPr>
+            </w:r>
+            <w:r>
+              <w:rPr>
+                <w:b/>
+                <w:sz w:val="19"/>
+              </w:rPr>
+              <w:t>4. Research objective 1</w:t>
+            </w:r>
+            <w:r>
+              <w:rPr>
+                <w:sz w:val="19"/>
+              </w:rPr>
+              <w:t xml:space="preserve"> (what the survey will measure, about whom)</w:t>
+            </w:r>
+          </w:p>
+        </w:tc>
+        <w:tc>
+          <w:tcPr>
+            <w:tcW w:type="dxa" w:w="4968"/>
+          </w:tcPr>
+          <w:p>
+            <w:r>
+              <w:rPr>
+                <w:sz w:val="19"/>
+              </w:rPr>
+            </w:r>
+          </w:p>
+        </w:tc>
+      </w:tr>
+      <w:tr>
+        <w:tc>
+          <w:tcPr>
+            <w:tcW w:type="dxa" w:w="4968"/>
+          </w:tcPr>
+          <w:p>
+            <w:r>
+              <w:rPr>
+                <w:sz w:val="19"/>
+              </w:rPr>
+            </w:r>
+            <w:r>
+              <w:rPr>
+                <w:b/>
+                <w:sz w:val="19"/>
+              </w:rPr>
+              <w:t>4. Research objective 2</w:t>
+            </w:r>
+          </w:p>
+        </w:tc>
+        <w:tc>
+          <w:tcPr>
+            <w:tcW w:type="dxa" w:w="4968"/>
+          </w:tcPr>
+          <w:p>
+            <w:r>
+              <w:rPr>
+                <w:sz w:val="19"/>
+              </w:rPr>
+            </w:r>
+          </w:p>
+        </w:tc>
+      </w:tr>
+      <w:tr>
+        <w:tc>
+          <w:tcPr>
+            <w:tcW w:type="dxa" w:w="4968"/>
+          </w:tcPr>
+          <w:p>
+            <w:r>
+              <w:rPr>
+                <w:sz w:val="19"/>
+              </w:rPr>
+            </w:r>
+            <w:r>
+              <w:rPr>
+                <w:b/>
+                <w:sz w:val="19"/>
+              </w:rPr>
+              <w:t>4. Research objective 3</w:t>
+            </w:r>
+          </w:p>
+        </w:tc>
+        <w:tc>
+          <w:tcPr>
+            <w:tcW w:type="dxa" w:w="4968"/>
+          </w:tcPr>
+          <w:p>
+            <w:r>
+              <w:rPr>
+                <w:sz w:val="19"/>
+              </w:rPr>
+            </w:r>
+          </w:p>
+        </w:tc>
+      </w:tr>
+      <w:tr>
+        <w:tc>
+          <w:tcPr>
+            <w:tcW w:type="dxa" w:w="4968"/>
+          </w:tcPr>
+          <w:p>
+            <w:r>
+              <w:rPr>
+                <w:sz w:val="19"/>
+              </w:rPr>
+            </w:r>
+            <w:r>
+              <w:rPr>
+                <w:b/>
+                <w:sz w:val="19"/>
+              </w:rPr>
+              <w:t>4. Research objective 4</w:t>
+            </w:r>
+            <w:r>
+              <w:rPr>
+                <w:sz w:val="19"/>
+              </w:rPr>
+              <w:t xml:space="preserve"> (optional)</w:t>
+            </w:r>
+          </w:p>
+        </w:tc>
+        <w:tc>
+          <w:tcPr>
+            <w:tcW w:type="dxa" w:w="4968"/>
+          </w:tcPr>
+          <w:p>
+            <w:r>
+              <w:rPr>
+                <w:sz w:val="19"/>
+              </w:rPr>
+            </w:r>
+          </w:p>
+        </w:tc>
+      </w:tr>
+      <w:tr>
+        <w:tc>
+          <w:tcPr>
+            <w:tcW w:type="dxa" w:w="4968"/>
+          </w:tcPr>
+          <w:p>
+            <w:r>
+              <w:rPr>
+                <w:sz w:val="19"/>
+              </w:rPr>
+            </w:r>
+            <w:r>
+              <w:rPr>
+                <w:b/>
+                <w:sz w:val="19"/>
+              </w:rPr>
+              <w:t>Recommendation</w:t>
+            </w:r>
+            <w:r>
+              <w:rPr>
+                <w:sz w:val="19"/>
+              </w:rPr>
+              <w:t xml:space="preserve"> — should he research first or just build? Why?</w:t>
+            </w:r>
+          </w:p>
+        </w:tc>
+        <w:tc>
+          <w:tcPr>
+            <w:tcW w:type="dxa" w:w="4968"/>
+          </w:tcPr>
+          <w:p>
+            <w:r>
+              <w:rPr>
+                <w:sz w:val="19"/>
+              </w:rPr>
+            </w:r>
+          </w:p>
+        </w:tc>
+      </w:tr>
+    </w:tbl>
+    <w:p/>
+    <w:p>
+      <w:pPr>
+        <w:pStyle w:val="Heading3"/>
+      </w:pPr>
+      <w:r>
+        <w:t>Box C — Delta log</w:t>
+      </w:r>
+    </w:p>
+    <w:tbl>
+      <w:tblPr>
+        <w:tblStyle w:val="TableGrid"/>
+        <w:tblW w:type="auto" w:w="0"/>
+        <w:tblLook w:firstColumn="1" w:firstRow="1" w:lastColumn="0" w:lastRow="0" w:noHBand="0" w:noVBand="1" w:val="04A0"/>
+      </w:tblPr>
+      <w:tblGrid>
+        <w:gridCol w:w="4968"/>
+        <w:gridCol w:w="4968"/>
+      </w:tblGrid>
+      <w:tr>
+        <w:tc>
+          <w:tcPr>
+            <w:tcW w:type="dxa" w:w="4968"/>
+          </w:tcPr>
+          <w:p>
+            <w:r>
+              <w:rPr>
+                <w:b/>
+                <w:sz w:val="19"/>
+              </w:rPr>
+            </w:r>
+            <w:r>
+              <w:rPr>
+                <w:b/>
+                <w:sz w:val="19"/>
+              </w:rPr>
+              <w:t>Prompt</w:t>
+            </w:r>
+          </w:p>
+        </w:tc>
+        <w:tc>
+          <w:tcPr>
+            <w:tcW w:type="dxa" w:w="4968"/>
+          </w:tcPr>
+          <w:p>
+            <w:r>
+              <w:rPr>
+                <w:b/>
+                <w:sz w:val="19"/>
+              </w:rPr>
+            </w:r>
+            <w:r>
+              <w:rPr>
+                <w:b/>
+                <w:sz w:val="19"/>
+              </w:rPr>
+              <w:t>Your answer (≤ 60 words each)</w:t>
+            </w:r>
+          </w:p>
+        </w:tc>
+      </w:tr>
+      <w:tr>
+        <w:tc>
+          <w:tcPr>
+            <w:tcW w:type="dxa" w:w="4968"/>
+          </w:tcPr>
+          <w:p>
+            <w:r>
+              <w:rPr>
+                <w:sz w:val="19"/>
+              </w:rPr>
+            </w:r>
+            <w:r>
+              <w:rPr>
+                <w:b/>
+                <w:sz w:val="19"/>
+              </w:rPr>
+              <w:t>1. The push</w:t>
+            </w:r>
+            <w:r>
+              <w:rPr>
+                <w:sz w:val="19"/>
+              </w:rPr>
+              <w:t xml:space="preserve"> — what the tutor challenged, and where you decided your answer was good enough and stopped</w:t>
+            </w:r>
+          </w:p>
+        </w:tc>
+        <w:tc>
+          <w:tcPr>
+            <w:tcW w:type="dxa" w:w="4968"/>
+          </w:tcPr>
+          <w:p>
+            <w:r>
+              <w:rPr>
+                <w:sz w:val="19"/>
+              </w:rPr>
+            </w:r>
+          </w:p>
+        </w:tc>
+      </w:tr>
+      <w:tr>
+        <w:tc>
+          <w:tcPr>
+            <w:tcW w:type="dxa" w:w="4968"/>
+          </w:tcPr>
+          <w:p>
+            <w:r>
+              <w:rPr>
+                <w:sz w:val="19"/>
+              </w:rPr>
+            </w:r>
+            <w:r>
+              <w:rPr>
+                <w:b/>
+                <w:sz w:val="19"/>
+              </w:rPr>
+              <w:t>2. What changed A → B</w:t>
+            </w:r>
+            <w:r>
+              <w:rPr>
+                <w:sz w:val="19"/>
+              </w:rPr>
+              <w:t xml:space="preserve"> — one tag per change: [evidence] [concept] [structure] [wording]; or "nothing changed, because…"</w:t>
+            </w:r>
+          </w:p>
+        </w:tc>
+        <w:tc>
+          <w:tcPr>
+            <w:tcW w:type="dxa" w:w="4968"/>
+          </w:tcPr>
+          <w:p>
+            <w:r>
+              <w:rPr>
+                <w:sz w:val="19"/>
+              </w:rPr>
+            </w:r>
+          </w:p>
+        </w:tc>
+      </w:tr>
+      <w:tr>
+        <w:tc>
+          <w:tcPr>
+            <w:tcW w:type="dxa" w:w="4968"/>
+          </w:tcPr>
+          <w:p>
+            <w:r>
+              <w:rPr>
+                <w:sz w:val="19"/>
+              </w:rPr>
+            </w:r>
+            <w:r>
+              <w:rPr>
+                <w:b/>
+                <w:sz w:val="19"/>
+              </w:rPr>
+              <w:t>3. A suggestion I rejected or pushed back on, and why</w:t>
+            </w:r>
+            <w:r>
+              <w:rPr>
+                <w:sz w:val="19"/>
+              </w:rPr>
+              <w:t xml:space="preserve"> — if none, write "none" and name what you checked against the chapter</w:t>
+            </w:r>
+          </w:p>
+        </w:tc>
+        <w:tc>
+          <w:tcPr>
+            <w:tcW w:type="dxa" w:w="4968"/>
+          </w:tcPr>
+          <w:p>
+            <w:r>
+              <w:rPr>
+                <w:sz w:val="19"/>
+              </w:rPr>
+            </w:r>
+          </w:p>
+        </w:tc>
+      </w:tr>
+      <w:tr>
+        <w:tc>
+          <w:tcPr>
+            <w:tcW w:type="dxa" w:w="4968"/>
+          </w:tcPr>
+          <w:p>
+            <w:r>
+              <w:rPr>
+                <w:sz w:val="19"/>
+              </w:rPr>
+            </w:r>
+            <w:r>
+              <w:rPr>
+                <w:b/>
+                <w:sz w:val="19"/>
+              </w:rPr>
+              <w:t>4. Transcript link</w:t>
+            </w:r>
+            <w:r>
+              <w:rPr>
+                <w:sz w:val="19"/>
+              </w:rPr>
+              <w:t xml:space="preserve"> — Google Doc (scroll to the top, select all, paste without formatting, share as Anyone with the link) or a Drive link to the printed PDF. Not a chatgpt.com/c/ URL, not OneDrive, not a summary</w:t>
             </w:r>
           </w:p>
         </w:tc>

</xml_diff>

<commit_message>
Deploy simternship build 2026-09-12
</commit_message>
<xml_diff>
--- a/hub/files/Case1.docx
+++ b/hub/files/Case1.docx
@@ -316,8 +316,12 @@
     </w:p>
     <w:p>
       <w:pPr>
-        <w:pStyle w:val="ListNumber"/>
+        <w:ind w:left="432" w:hanging="432"/>
       </w:pPr>
+      <w:r>
+        <w:t>1.</w:t>
+        <w:tab/>
+      </w:r>
       <w:r>
         <w:t xml:space="preserve">Read the case (Appendix A) individually, then fill </w:t>
       </w:r>
@@ -333,8 +337,12 @@
     </w:p>
     <w:p>
       <w:pPr>
-        <w:pStyle w:val="ListNumber"/>
+        <w:ind w:left="432" w:hanging="432"/>
       </w:pPr>
+      <w:r>
+        <w:t>2.</w:t>
+        <w:tab/>
+      </w:r>
       <w:r>
         <w:t xml:space="preserve">State the </w:t>
       </w:r>
@@ -350,8 +358,12 @@
     </w:p>
     <w:p>
       <w:pPr>
-        <w:pStyle w:val="ListNumber"/>
+        <w:ind w:left="432" w:hanging="432"/>
       </w:pPr>
+      <w:r>
+        <w:t>3.</w:t>
+        <w:tab/>
+      </w:r>
       <w:r>
         <w:t xml:space="preserve">List the </w:t>
       </w:r>
@@ -367,8 +379,12 @@
     </w:p>
     <w:p>
       <w:pPr>
-        <w:pStyle w:val="ListNumber"/>
+        <w:ind w:left="432" w:hanging="432"/>
       </w:pPr>
+      <w:r>
+        <w:t>4.</w:t>
+        <w:tab/>
+      </w:r>
       <w:r>
         <w:t xml:space="preserve">For each decision, list the </w:t>
       </w:r>
@@ -384,8 +400,12 @@
     </w:p>
     <w:p>
       <w:pPr>
-        <w:pStyle w:val="ListNumber"/>
+        <w:ind w:left="432" w:hanging="432"/>
       </w:pPr>
+      <w:r>
+        <w:t>5.</w:t>
+        <w:tab/>
+      </w:r>
       <w:r>
         <w:t xml:space="preserve">Translate the information needs into </w:t>
       </w:r>
@@ -401,8 +421,12 @@
     </w:p>
     <w:p>
       <w:pPr>
-        <w:pStyle w:val="ListNumber"/>
+        <w:ind w:left="432" w:hanging="432"/>
       </w:pPr>
+      <w:r>
+        <w:t>6.</w:t>
+        <w:tab/>
+      </w:r>
       <w:r>
         <w:t xml:space="preserve">Run the voice session (one push minimum), then fill </w:t>
       </w:r>
@@ -567,7 +591,7 @@
         <w:t>Write-up (5 pts, every student, individual):</w:t>
       </w:r>
       <w:r>
-        <w:t xml:space="preserve"> 5 = Box B complete and substantially correct against the key, Box A visibly earlier and rougher than B, Box C shows one real push with a tagged change or a reasoned "kept it", link opens · 3 = complete, but Box A mirrors B, Box C generic, or a major content error · 1 = a box or the link missing · 0 = not submitted. The rubric below is the one your team's Cases 2–6 presentation (20 pts) will be scored on; my demo models it.</w:t>
+        <w:t xml:space="preserve"> 5 = Box B complete and substantially correct against the key, Box A visibly earlier and rougher than B, Box C shows one real push with a tagged change or a reasoned "kept it", link opens · 3 = complete, but Box A mirrors B, Box C generic, or a major content error · 1 = a box or the link missing · 0 = not submitted. The rubric below is the one your team's Cases 2–6 presentation (10 pts) will be scored on; my demo models it.</w:t>
       </w:r>
     </w:p>
     <w:tbl>
@@ -1009,32 +1033,48 @@
     </w:p>
     <w:p>
       <w:pPr>
-        <w:pStyle w:val="ListNumber"/>
+        <w:ind w:left="432" w:hanging="432"/>
       </w:pPr>
+      <w:r>
+        <w:t>1.</w:t>
+        <w:tab/>
+      </w:r>
       <w:r>
         <w:t>What is the overall management problem?</w:t>
       </w:r>
     </w:p>
     <w:p>
       <w:pPr>
-        <w:pStyle w:val="ListNumber"/>
+        <w:ind w:left="432" w:hanging="432"/>
       </w:pPr>
+      <w:r>
+        <w:t>2.</w:t>
+        <w:tab/>
+      </w:r>
       <w:r>
         <w:t>What are the major decisions this book dealer needs to make?</w:t>
       </w:r>
     </w:p>
     <w:p>
       <w:pPr>
-        <w:pStyle w:val="ListNumber"/>
+        <w:ind w:left="432" w:hanging="432"/>
       </w:pPr>
+      <w:r>
+        <w:t>3.</w:t>
+        <w:tab/>
+      </w:r>
       <w:r>
         <w:t>What information does the book dealer need to make these decisions?</w:t>
       </w:r>
     </w:p>
     <w:p>
       <w:pPr>
-        <w:pStyle w:val="ListNumber"/>
+        <w:ind w:left="432" w:hanging="432"/>
       </w:pPr>
+      <w:r>
+        <w:t>4.</w:t>
+        <w:tab/>
+      </w:r>
       <w:r>
         <w:t>If you were conducting a survey to help this book dealer make these decisions, what research objectives should you have for the survey?</w:t>
       </w:r>

</xml_diff>

<commit_message>
Deploy simternship build 2026-09-14
</commit_message>
<xml_diff>
--- a/hub/files/Case1.docx
+++ b/hub/files/Case1.docx
@@ -205,6 +205,35 @@
       </w:tr>
     </w:tbl>
     <w:p/>
+    <w:p>
+      <w:r>
+        <w:rPr>
+          <w:b/>
+        </w:rPr>
+        <w:t>Two different things each week.</w:t>
+      </w:r>
+      <w:r>
+        <w:t xml:space="preserve"> </w:t>
+      </w:r>
+      <w:r>
+        <w:rPr>
+          <w:i/>
+        </w:rPr>
+        <w:t>Everyone</w:t>
+      </w:r>
+      <w:r>
+        <w:t xml:space="preserve"> writes up </w:t>
+      </w:r>
+      <w:r>
+        <w:rPr>
+          <w:i/>
+        </w:rPr>
+        <w:t>this</w:t>
+      </w:r>
+      <w:r>
+        <w:t xml:space="preserve"> case. One team presents the case named in its Canvas group ("Team N presents Case N+1"); the group name never changes which write-up is due.</w:t>
+      </w:r>
+    </w:p>
     <w:p>
       <w:r>
         <w:rPr>

</xml_diff>